<commit_message>
docs: update commit reference after history rewrite
</commit_message>
<xml_diff>
--- a/docs/word/Dokumentasi-Teknis-LabTrack.docx
+++ b/docs/word/Dokumentasi-Teknis-LabTrack.docx
@@ -69,7 +69,7 @@
         <w:rPr>
           <w:sz w:val="21"/>
         </w:rPr>
-        <w:t xml:space="preserve"> 1.0.2 (commit 81840b2)</w:t>
+        <w:t xml:space="preserve"> 1.0.2 (commit 86d0b79)</w:t>
       </w:r>
     </w:p>
     <w:p>
@@ -291,7 +291,7 @@
         <w:fldChar w:fldCharType="begin"/>
       </w:r>
       <w:r>
-        <w:instrText xml:space="preserve"> HYPERLINK \l _Toc12791 </w:instrText>
+        <w:instrText xml:space="preserve"> HYPERLINK \l _Toc20501 </w:instrText>
       </w:r>
       <w:r>
         <w:fldChar w:fldCharType="separate"/>
@@ -306,7 +306,7 @@
         <w:fldChar w:fldCharType="begin"/>
       </w:r>
       <w:r>
-        <w:instrText xml:space="preserve"> PAGEREF _Toc12791 \h </w:instrText>
+        <w:instrText xml:space="preserve"> PAGEREF _Toc20501 \h </w:instrText>
       </w:r>
       <w:r>
         <w:fldChar w:fldCharType="separate"/>
@@ -332,7 +332,7 @@
         <w:fldChar w:fldCharType="begin"/>
       </w:r>
       <w:r>
-        <w:instrText xml:space="preserve"> HYPERLINK \l _Toc24010 </w:instrText>
+        <w:instrText xml:space="preserve"> HYPERLINK \l _Toc20838 </w:instrText>
       </w:r>
       <w:r>
         <w:fldChar w:fldCharType="separate"/>
@@ -347,7 +347,7 @@
         <w:fldChar w:fldCharType="begin"/>
       </w:r>
       <w:r>
-        <w:instrText xml:space="preserve"> PAGEREF _Toc24010 \h </w:instrText>
+        <w:instrText xml:space="preserve"> PAGEREF _Toc20838 \h </w:instrText>
       </w:r>
       <w:r>
         <w:fldChar w:fldCharType="separate"/>
@@ -373,7 +373,7 @@
         <w:fldChar w:fldCharType="begin"/>
       </w:r>
       <w:r>
-        <w:instrText xml:space="preserve"> HYPERLINK \l _Toc15160 </w:instrText>
+        <w:instrText xml:space="preserve"> HYPERLINK \l _Toc16741 </w:instrText>
       </w:r>
       <w:r>
         <w:fldChar w:fldCharType="separate"/>
@@ -388,7 +388,7 @@
         <w:fldChar w:fldCharType="begin"/>
       </w:r>
       <w:r>
-        <w:instrText xml:space="preserve"> PAGEREF _Toc15160 \h </w:instrText>
+        <w:instrText xml:space="preserve"> PAGEREF _Toc16741 \h </w:instrText>
       </w:r>
       <w:r>
         <w:fldChar w:fldCharType="separate"/>
@@ -414,7 +414,7 @@
         <w:fldChar w:fldCharType="begin"/>
       </w:r>
       <w:r>
-        <w:instrText xml:space="preserve"> HYPERLINK \l _Toc10220 </w:instrText>
+        <w:instrText xml:space="preserve"> HYPERLINK \l _Toc4548 </w:instrText>
       </w:r>
       <w:r>
         <w:fldChar w:fldCharType="separate"/>
@@ -429,7 +429,7 @@
         <w:fldChar w:fldCharType="begin"/>
       </w:r>
       <w:r>
-        <w:instrText xml:space="preserve"> PAGEREF _Toc10220 \h </w:instrText>
+        <w:instrText xml:space="preserve"> PAGEREF _Toc4548 \h </w:instrText>
       </w:r>
       <w:r>
         <w:fldChar w:fldCharType="separate"/>
@@ -455,7 +455,7 @@
         <w:fldChar w:fldCharType="begin"/>
       </w:r>
       <w:r>
-        <w:instrText xml:space="preserve"> HYPERLINK \l _Toc7111 </w:instrText>
+        <w:instrText xml:space="preserve"> HYPERLINK \l _Toc2817 </w:instrText>
       </w:r>
       <w:r>
         <w:fldChar w:fldCharType="separate"/>
@@ -470,7 +470,7 @@
         <w:fldChar w:fldCharType="begin"/>
       </w:r>
       <w:r>
-        <w:instrText xml:space="preserve"> PAGEREF _Toc7111 \h </w:instrText>
+        <w:instrText xml:space="preserve"> PAGEREF _Toc2817 \h </w:instrText>
       </w:r>
       <w:r>
         <w:fldChar w:fldCharType="separate"/>
@@ -496,7 +496,7 @@
         <w:fldChar w:fldCharType="begin"/>
       </w:r>
       <w:r>
-        <w:instrText xml:space="preserve"> HYPERLINK \l _Toc30591 </w:instrText>
+        <w:instrText xml:space="preserve"> HYPERLINK \l _Toc15848 </w:instrText>
       </w:r>
       <w:r>
         <w:fldChar w:fldCharType="separate"/>
@@ -511,7 +511,7 @@
         <w:fldChar w:fldCharType="begin"/>
       </w:r>
       <w:r>
-        <w:instrText xml:space="preserve"> PAGEREF _Toc30591 \h </w:instrText>
+        <w:instrText xml:space="preserve"> PAGEREF _Toc15848 \h </w:instrText>
       </w:r>
       <w:r>
         <w:fldChar w:fldCharType="separate"/>
@@ -537,7 +537,7 @@
         <w:fldChar w:fldCharType="begin"/>
       </w:r>
       <w:r>
-        <w:instrText xml:space="preserve"> HYPERLINK \l _Toc20203 </w:instrText>
+        <w:instrText xml:space="preserve"> HYPERLINK \l _Toc28748 </w:instrText>
       </w:r>
       <w:r>
         <w:fldChar w:fldCharType="separate"/>
@@ -552,7 +552,7 @@
         <w:fldChar w:fldCharType="begin"/>
       </w:r>
       <w:r>
-        <w:instrText xml:space="preserve"> PAGEREF _Toc20203 \h </w:instrText>
+        <w:instrText xml:space="preserve"> PAGEREF _Toc28748 \h </w:instrText>
       </w:r>
       <w:r>
         <w:fldChar w:fldCharType="separate"/>
@@ -578,7 +578,7 @@
         <w:fldChar w:fldCharType="begin"/>
       </w:r>
       <w:r>
-        <w:instrText xml:space="preserve"> HYPERLINK \l _Toc6043 </w:instrText>
+        <w:instrText xml:space="preserve"> HYPERLINK \l _Toc17157 </w:instrText>
       </w:r>
       <w:r>
         <w:fldChar w:fldCharType="separate"/>
@@ -593,7 +593,7 @@
         <w:fldChar w:fldCharType="begin"/>
       </w:r>
       <w:r>
-        <w:instrText xml:space="preserve"> PAGEREF _Toc6043 \h </w:instrText>
+        <w:instrText xml:space="preserve"> PAGEREF _Toc17157 \h </w:instrText>
       </w:r>
       <w:r>
         <w:fldChar w:fldCharType="separate"/>
@@ -619,7 +619,7 @@
         <w:fldChar w:fldCharType="begin"/>
       </w:r>
       <w:r>
-        <w:instrText xml:space="preserve"> HYPERLINK \l _Toc25760 </w:instrText>
+        <w:instrText xml:space="preserve"> HYPERLINK \l _Toc27549 </w:instrText>
       </w:r>
       <w:r>
         <w:fldChar w:fldCharType="separate"/>
@@ -634,7 +634,7 @@
         <w:fldChar w:fldCharType="begin"/>
       </w:r>
       <w:r>
-        <w:instrText xml:space="preserve"> PAGEREF _Toc25760 \h </w:instrText>
+        <w:instrText xml:space="preserve"> PAGEREF _Toc27549 \h </w:instrText>
       </w:r>
       <w:r>
         <w:fldChar w:fldCharType="separate"/>
@@ -660,7 +660,7 @@
         <w:fldChar w:fldCharType="begin"/>
       </w:r>
       <w:r>
-        <w:instrText xml:space="preserve"> HYPERLINK \l _Toc3205 </w:instrText>
+        <w:instrText xml:space="preserve"> HYPERLINK \l _Toc13377 </w:instrText>
       </w:r>
       <w:r>
         <w:fldChar w:fldCharType="separate"/>
@@ -675,7 +675,7 @@
         <w:fldChar w:fldCharType="begin"/>
       </w:r>
       <w:r>
-        <w:instrText xml:space="preserve"> PAGEREF _Toc3205 \h </w:instrText>
+        <w:instrText xml:space="preserve"> PAGEREF _Toc13377 \h </w:instrText>
       </w:r>
       <w:r>
         <w:fldChar w:fldCharType="separate"/>
@@ -701,7 +701,7 @@
         <w:fldChar w:fldCharType="begin"/>
       </w:r>
       <w:r>
-        <w:instrText xml:space="preserve"> HYPERLINK \l _Toc7012 </w:instrText>
+        <w:instrText xml:space="preserve"> HYPERLINK \l _Toc25857 </w:instrText>
       </w:r>
       <w:r>
         <w:fldChar w:fldCharType="separate"/>
@@ -716,7 +716,7 @@
         <w:fldChar w:fldCharType="begin"/>
       </w:r>
       <w:r>
-        <w:instrText xml:space="preserve"> PAGEREF _Toc7012 \h </w:instrText>
+        <w:instrText xml:space="preserve"> PAGEREF _Toc25857 \h </w:instrText>
       </w:r>
       <w:r>
         <w:fldChar w:fldCharType="separate"/>
@@ -742,7 +742,7 @@
         <w:fldChar w:fldCharType="begin"/>
       </w:r>
       <w:r>
-        <w:instrText xml:space="preserve"> HYPERLINK \l _Toc207 </w:instrText>
+        <w:instrText xml:space="preserve"> HYPERLINK \l _Toc31979 </w:instrText>
       </w:r>
       <w:r>
         <w:fldChar w:fldCharType="separate"/>
@@ -757,7 +757,7 @@
         <w:fldChar w:fldCharType="begin"/>
       </w:r>
       <w:r>
-        <w:instrText xml:space="preserve"> PAGEREF _Toc207 \h </w:instrText>
+        <w:instrText xml:space="preserve"> PAGEREF _Toc31979 \h </w:instrText>
       </w:r>
       <w:r>
         <w:fldChar w:fldCharType="separate"/>
@@ -783,7 +783,7 @@
         <w:fldChar w:fldCharType="begin"/>
       </w:r>
       <w:r>
-        <w:instrText xml:space="preserve"> HYPERLINK \l _Toc26984 </w:instrText>
+        <w:instrText xml:space="preserve"> HYPERLINK \l _Toc6176 </w:instrText>
       </w:r>
       <w:r>
         <w:fldChar w:fldCharType="separate"/>
@@ -798,7 +798,7 @@
         <w:fldChar w:fldCharType="begin"/>
       </w:r>
       <w:r>
-        <w:instrText xml:space="preserve"> PAGEREF _Toc26984 \h </w:instrText>
+        <w:instrText xml:space="preserve"> PAGEREF _Toc6176 \h </w:instrText>
       </w:r>
       <w:r>
         <w:fldChar w:fldCharType="separate"/>
@@ -824,7 +824,7 @@
         <w:fldChar w:fldCharType="begin"/>
       </w:r>
       <w:r>
-        <w:instrText xml:space="preserve"> HYPERLINK \l _Toc14397 </w:instrText>
+        <w:instrText xml:space="preserve"> HYPERLINK \l _Toc14678 </w:instrText>
       </w:r>
       <w:r>
         <w:fldChar w:fldCharType="separate"/>
@@ -839,7 +839,7 @@
         <w:fldChar w:fldCharType="begin"/>
       </w:r>
       <w:r>
-        <w:instrText xml:space="preserve"> PAGEREF _Toc14397 \h </w:instrText>
+        <w:instrText xml:space="preserve"> PAGEREF _Toc14678 \h </w:instrText>
       </w:r>
       <w:r>
         <w:fldChar w:fldCharType="separate"/>
@@ -865,7 +865,7 @@
         <w:fldChar w:fldCharType="begin"/>
       </w:r>
       <w:r>
-        <w:instrText xml:space="preserve"> HYPERLINK \l _Toc30801 </w:instrText>
+        <w:instrText xml:space="preserve"> HYPERLINK \l _Toc27168 </w:instrText>
       </w:r>
       <w:r>
         <w:fldChar w:fldCharType="separate"/>
@@ -880,7 +880,7 @@
         <w:fldChar w:fldCharType="begin"/>
       </w:r>
       <w:r>
-        <w:instrText xml:space="preserve"> PAGEREF _Toc30801 \h </w:instrText>
+        <w:instrText xml:space="preserve"> PAGEREF _Toc27168 \h </w:instrText>
       </w:r>
       <w:r>
         <w:fldChar w:fldCharType="separate"/>
@@ -906,7 +906,7 @@
         <w:fldChar w:fldCharType="begin"/>
       </w:r>
       <w:r>
-        <w:instrText xml:space="preserve"> HYPERLINK \l _Toc7948 </w:instrText>
+        <w:instrText xml:space="preserve"> HYPERLINK \l _Toc5037 </w:instrText>
       </w:r>
       <w:r>
         <w:fldChar w:fldCharType="separate"/>
@@ -921,7 +921,7 @@
         <w:fldChar w:fldCharType="begin"/>
       </w:r>
       <w:r>
-        <w:instrText xml:space="preserve"> PAGEREF _Toc7948 \h </w:instrText>
+        <w:instrText xml:space="preserve"> PAGEREF _Toc5037 \h </w:instrText>
       </w:r>
       <w:r>
         <w:fldChar w:fldCharType="separate"/>
@@ -947,7 +947,7 @@
         <w:fldChar w:fldCharType="begin"/>
       </w:r>
       <w:r>
-        <w:instrText xml:space="preserve"> HYPERLINK \l _Toc28648 </w:instrText>
+        <w:instrText xml:space="preserve"> HYPERLINK \l _Toc14264 </w:instrText>
       </w:r>
       <w:r>
         <w:fldChar w:fldCharType="separate"/>
@@ -962,7 +962,7 @@
         <w:fldChar w:fldCharType="begin"/>
       </w:r>
       <w:r>
-        <w:instrText xml:space="preserve"> PAGEREF _Toc28648 \h </w:instrText>
+        <w:instrText xml:space="preserve"> PAGEREF _Toc14264 \h </w:instrText>
       </w:r>
       <w:r>
         <w:fldChar w:fldCharType="separate"/>
@@ -988,7 +988,7 @@
         <w:fldChar w:fldCharType="begin"/>
       </w:r>
       <w:r>
-        <w:instrText xml:space="preserve"> HYPERLINK \l _Toc87 </w:instrText>
+        <w:instrText xml:space="preserve"> HYPERLINK \l _Toc11317 </w:instrText>
       </w:r>
       <w:r>
         <w:fldChar w:fldCharType="separate"/>
@@ -1003,7 +1003,7 @@
         <w:fldChar w:fldCharType="begin"/>
       </w:r>
       <w:r>
-        <w:instrText xml:space="preserve"> PAGEREF _Toc87 \h </w:instrText>
+        <w:instrText xml:space="preserve"> PAGEREF _Toc11317 \h </w:instrText>
       </w:r>
       <w:r>
         <w:fldChar w:fldCharType="separate"/>
@@ -1029,7 +1029,7 @@
         <w:fldChar w:fldCharType="begin"/>
       </w:r>
       <w:r>
-        <w:instrText xml:space="preserve"> HYPERLINK \l _Toc3952 </w:instrText>
+        <w:instrText xml:space="preserve"> HYPERLINK \l _Toc9430 </w:instrText>
       </w:r>
       <w:r>
         <w:fldChar w:fldCharType="separate"/>
@@ -1044,7 +1044,7 @@
         <w:fldChar w:fldCharType="begin"/>
       </w:r>
       <w:r>
-        <w:instrText xml:space="preserve"> PAGEREF _Toc3952 \h </w:instrText>
+        <w:instrText xml:space="preserve"> PAGEREF _Toc9430 \h </w:instrText>
       </w:r>
       <w:r>
         <w:fldChar w:fldCharType="separate"/>
@@ -1070,7 +1070,7 @@
         <w:fldChar w:fldCharType="begin"/>
       </w:r>
       <w:r>
-        <w:instrText xml:space="preserve"> HYPERLINK \l _Toc1189 </w:instrText>
+        <w:instrText xml:space="preserve"> HYPERLINK \l _Toc4315 </w:instrText>
       </w:r>
       <w:r>
         <w:fldChar w:fldCharType="separate"/>
@@ -1085,7 +1085,7 @@
         <w:fldChar w:fldCharType="begin"/>
       </w:r>
       <w:r>
-        <w:instrText xml:space="preserve"> PAGEREF _Toc1189 \h </w:instrText>
+        <w:instrText xml:space="preserve"> PAGEREF _Toc4315 \h </w:instrText>
       </w:r>
       <w:r>
         <w:fldChar w:fldCharType="separate"/>
@@ -1111,7 +1111,7 @@
         <w:fldChar w:fldCharType="begin"/>
       </w:r>
       <w:r>
-        <w:instrText xml:space="preserve"> HYPERLINK \l _Toc21110 </w:instrText>
+        <w:instrText xml:space="preserve"> HYPERLINK \l _Toc646 </w:instrText>
       </w:r>
       <w:r>
         <w:fldChar w:fldCharType="separate"/>
@@ -1126,7 +1126,7 @@
         <w:fldChar w:fldCharType="begin"/>
       </w:r>
       <w:r>
-        <w:instrText xml:space="preserve"> PAGEREF _Toc21110 \h </w:instrText>
+        <w:instrText xml:space="preserve"> PAGEREF _Toc646 \h </w:instrText>
       </w:r>
       <w:r>
         <w:fldChar w:fldCharType="separate"/>
@@ -1155,7 +1155,7 @@
       <w:pPr>
         <w:pStyle w:val="2"/>
       </w:pPr>
-      <w:bookmarkStart w:id="0" w:name="_Toc12791"/>
+      <w:bookmarkStart w:id="0" w:name="_Toc20501"/>
       <w:r>
         <w:t>1.  Tentang dokumen ini</w:t>
       </w:r>
@@ -1552,7 +1552,7 @@
       <w:pPr>
         <w:pStyle w:val="2"/>
       </w:pPr>
-      <w:bookmarkStart w:id="1" w:name="_Toc24010"/>
+      <w:bookmarkStart w:id="1" w:name="_Toc20838"/>
       <w:r>
         <w:t>2.  Arsitektur</w:t>
       </w:r>
@@ -2501,7 +2501,7 @@
       <w:pPr>
         <w:pStyle w:val="3"/>
       </w:pPr>
-      <w:bookmarkStart w:id="2" w:name="_Toc15160"/>
+      <w:bookmarkStart w:id="2" w:name="_Toc16741"/>
       <w:r>
         <w:t>2.1  Akun layanan dan izin</w:t>
       </w:r>
@@ -2570,6 +2570,12 @@
             <w:insideH w:val="single" w:color="auto" w:sz="4" w:space="0"/>
             <w:insideV w:val="single" w:color="auto" w:sz="4" w:space="0"/>
           </w:tblBorders>
+          <w:tblCellMar>
+            <w:top w:w="0" w:type="dxa"/>
+            <w:left w:w="108" w:type="dxa"/>
+            <w:bottom w:w="0" w:type="dxa"/>
+            <w:right w:w="108" w:type="dxa"/>
+          </w:tblCellMar>
         </w:tblPrEx>
         <w:trPr>
           <w:tblHeader/>
@@ -3008,7 +3014,7 @@
       <w:pPr>
         <w:pStyle w:val="3"/>
       </w:pPr>
-      <w:bookmarkStart w:id="3" w:name="_Toc10220"/>
+      <w:bookmarkStart w:id="3" w:name="_Toc4548"/>
       <w:r>
         <w:t>2.2  Model data</w:t>
       </w:r>
@@ -3781,7 +3787,7 @@
       <w:pPr>
         <w:pStyle w:val="2"/>
       </w:pPr>
-      <w:bookmarkStart w:id="4" w:name="_Toc7111"/>
+      <w:bookmarkStart w:id="4" w:name="_Toc2817"/>
       <w:r>
         <w:t>3.  Menjalankan di lingkungan lokal</w:t>
       </w:r>
@@ -3927,7 +3933,7 @@
       <w:pPr>
         <w:pStyle w:val="3"/>
       </w:pPr>
-      <w:bookmarkStart w:id="5" w:name="_Toc30591"/>
+      <w:bookmarkStart w:id="5" w:name="_Toc15848"/>
       <w:r>
         <w:t>3.1  Variabel lingkungan</w:t>
       </w:r>
@@ -5045,7 +5051,7 @@
       <w:pPr>
         <w:pStyle w:val="2"/>
       </w:pPr>
-      <w:bookmarkStart w:id="6" w:name="_Toc20203"/>
+      <w:bookmarkStart w:id="6" w:name="_Toc28748"/>
       <w:r>
         <w:t>4.  API</w:t>
       </w:r>
@@ -5192,6 +5198,12 @@
             <w:insideH w:val="single" w:color="auto" w:sz="4" w:space="0"/>
             <w:insideV w:val="single" w:color="auto" w:sz="4" w:space="0"/>
           </w:tblBorders>
+          <w:tblCellMar>
+            <w:top w:w="0" w:type="dxa"/>
+            <w:left w:w="108" w:type="dxa"/>
+            <w:bottom w:w="0" w:type="dxa"/>
+            <w:right w:w="108" w:type="dxa"/>
+          </w:tblCellMar>
         </w:tblPrEx>
         <w:trPr>
           <w:tblHeader/>
@@ -6814,7 +6826,7 @@
       <w:pPr>
         <w:pStyle w:val="3"/>
       </w:pPr>
-      <w:bookmarkStart w:id="7" w:name="_Toc6043"/>
+      <w:bookmarkStart w:id="7" w:name="_Toc17157"/>
       <w:r>
         <w:t>4.1  Format galat</w:t>
       </w:r>
@@ -7490,7 +7502,7 @@
       <w:pPr>
         <w:pStyle w:val="3"/>
       </w:pPr>
-      <w:bookmarkStart w:id="8" w:name="_Toc25760"/>
+      <w:bookmarkStart w:id="8" w:name="_Toc27549"/>
       <w:r>
         <w:t>4.2  Contoh kehadiran massal (data contoh)</w:t>
       </w:r>
@@ -7647,7 +7659,7 @@
       <w:pPr>
         <w:pStyle w:val="2"/>
       </w:pPr>
-      <w:bookmarkStart w:id="9" w:name="_Toc3205"/>
+      <w:bookmarkStart w:id="9" w:name="_Toc13377"/>
       <w:r>
         <w:t>5.  Antarmuka web</w:t>
       </w:r>
@@ -7858,7 +7870,7 @@
       <w:pPr>
         <w:pStyle w:val="2"/>
       </w:pPr>
-      <w:bookmarkStart w:id="10" w:name="_Toc7012"/>
+      <w:bookmarkStart w:id="10" w:name="_Toc25857"/>
       <w:r>
         <w:t>6.  Infrastruktur sebagai kode</w:t>
       </w:r>
@@ -7868,7 +7880,7 @@
       <w:pPr>
         <w:pStyle w:val="3"/>
       </w:pPr>
-      <w:bookmarkStart w:id="11" w:name="_Toc207"/>
+      <w:bookmarkStart w:id="11" w:name="_Toc31979"/>
       <w:r>
         <w:t>6.1  Berkas Terraform</w:t>
       </w:r>
@@ -8415,7 +8427,7 @@
       <w:pPr>
         <w:pStyle w:val="3"/>
       </w:pPr>
-      <w:bookmarkStart w:id="12" w:name="_Toc26984"/>
+      <w:bookmarkStart w:id="12" w:name="_Toc6176"/>
       <w:r>
         <w:t>6.2  Variabel yang mengendalikan biaya</w:t>
       </w:r>
@@ -8766,7 +8778,7 @@
       <w:pPr>
         <w:pStyle w:val="3"/>
       </w:pPr>
-      <w:bookmarkStart w:id="13" w:name="_Toc14397"/>
+      <w:bookmarkStart w:id="13" w:name="_Toc14678"/>
       <w:r>
         <w:t>6.3  Perintah dasar</w:t>
       </w:r>
@@ -8901,7 +8913,7 @@
       <w:pPr>
         <w:pStyle w:val="2"/>
       </w:pPr>
-      <w:bookmarkStart w:id="14" w:name="_Toc30801"/>
+      <w:bookmarkStart w:id="14" w:name="_Toc27168"/>
       <w:r>
         <w:t>7.  CI/CD</w:t>
       </w:r>
@@ -9530,7 +9542,7 @@
       <w:pPr>
         <w:pStyle w:val="2"/>
       </w:pPr>
-      <w:bookmarkStart w:id="15" w:name="_Toc7948"/>
+      <w:bookmarkStart w:id="15" w:name="_Toc5037"/>
       <w:r>
         <w:t>8.  Operasi</w:t>
       </w:r>
@@ -10727,7 +10739,7 @@
       <w:pPr>
         <w:pStyle w:val="3"/>
       </w:pPr>
-      <w:bookmarkStart w:id="16" w:name="_Toc28648"/>
+      <w:bookmarkStart w:id="16" w:name="_Toc14264"/>
       <w:r>
         <w:t>8.1  Jadwal rutin</w:t>
       </w:r>
@@ -11399,7 +11411,7 @@
       <w:pPr>
         <w:pStyle w:val="2"/>
       </w:pPr>
-      <w:bookmarkStart w:id="17" w:name="_Toc87"/>
+      <w:bookmarkStart w:id="17" w:name="_Toc11317"/>
       <w:r>
         <w:t>9.  Pemantauan dan SLA</w:t>
       </w:r>
@@ -12247,7 +12259,7 @@
       <w:pPr>
         <w:pStyle w:val="2"/>
       </w:pPr>
-      <w:bookmarkStart w:id="18" w:name="_Toc3952"/>
+      <w:bookmarkStart w:id="18" w:name="_Toc9430"/>
       <w:r>
         <w:t>10.  Pemulihan bencana</w:t>
       </w:r>
@@ -13114,7 +13126,7 @@
       <w:pPr>
         <w:pStyle w:val="2"/>
       </w:pPr>
-      <w:bookmarkStart w:id="19" w:name="_Toc1189"/>
+      <w:bookmarkStart w:id="19" w:name="_Toc4315"/>
       <w:r>
         <w:t>11.  Keamanan</w:t>
       </w:r>
@@ -13738,7 +13750,7 @@
       <w:pPr>
         <w:pStyle w:val="2"/>
       </w:pPr>
-      <w:bookmarkStart w:id="20" w:name="_Toc21110"/>
+      <w:bookmarkStart w:id="20" w:name="_Toc646"/>
       <w:r>
         <w:t>12.  Batasan yang diketahui</w:t>
       </w:r>
@@ -14135,8 +14147,8 @@
     <w:lsdException w:uiPriority="99" w:name="Normal Indent"/>
     <w:lsdException w:uiPriority="99" w:name="footnote text"/>
     <w:lsdException w:uiPriority="99" w:name="annotation text"/>
-    <w:lsdException w:uiPriority="99" w:semiHidden="0" w:name="header"/>
-    <w:lsdException w:uiPriority="99" w:semiHidden="0" w:name="footer"/>
+    <w:lsdException w:qFormat="1" w:uiPriority="99" w:semiHidden="0" w:name="header"/>
+    <w:lsdException w:qFormat="1" w:uiPriority="99" w:semiHidden="0" w:name="footer"/>
     <w:lsdException w:uiPriority="99" w:name="index heading"/>
     <w:lsdException w:qFormat="1" w:uiPriority="35" w:name="caption"/>
     <w:lsdException w:uiPriority="99" w:name="table of figures"/>
@@ -14153,7 +14165,7 @@
     <w:lsdException w:uiPriority="99" w:name="toa heading"/>
     <w:lsdException w:uiPriority="99" w:semiHidden="0" w:name="List"/>
     <w:lsdException w:uiPriority="99" w:semiHidden="0" w:name="List Bullet"/>
-    <w:lsdException w:uiPriority="99" w:semiHidden="0" w:name="List Number"/>
+    <w:lsdException w:qFormat="1" w:uiPriority="99" w:semiHidden="0" w:name="List Number"/>
     <w:lsdException w:uiPriority="99" w:semiHidden="0" w:name="List 2"/>
     <w:lsdException w:qFormat="1" w:uiPriority="99" w:semiHidden="0" w:name="List 3"/>
     <w:lsdException w:uiPriority="99" w:name="List 4"/>
@@ -14162,15 +14174,15 @@
     <w:lsdException w:uiPriority="99" w:semiHidden="0" w:name="List Bullet 3"/>
     <w:lsdException w:uiPriority="99" w:name="List Bullet 4"/>
     <w:lsdException w:uiPriority="99" w:name="List Bullet 5"/>
-    <w:lsdException w:uiPriority="99" w:semiHidden="0" w:name="List Number 2"/>
-    <w:lsdException w:uiPriority="99" w:semiHidden="0" w:name="List Number 3"/>
+    <w:lsdException w:qFormat="1" w:uiPriority="99" w:semiHidden="0" w:name="List Number 2"/>
+    <w:lsdException w:qFormat="1" w:uiPriority="99" w:semiHidden="0" w:name="List Number 3"/>
     <w:lsdException w:uiPriority="99" w:name="List Number 4"/>
     <w:lsdException w:uiPriority="99" w:name="List Number 5"/>
     <w:lsdException w:qFormat="1" w:unhideWhenUsed="0" w:uiPriority="10" w:semiHidden="0" w:name="Title"/>
     <w:lsdException w:uiPriority="99" w:name="Closing"/>
     <w:lsdException w:uiPriority="99" w:name="Signature"/>
-    <w:lsdException w:uiPriority="1" w:name="Default Paragraph Font"/>
-    <w:lsdException w:uiPriority="99" w:semiHidden="0" w:name="Body Text"/>
+    <w:lsdException w:qFormat="1" w:uiPriority="1" w:name="Default Paragraph Font"/>
+    <w:lsdException w:qFormat="1" w:uiPriority="99" w:semiHidden="0" w:name="Body Text"/>
     <w:lsdException w:uiPriority="99" w:name="Body Text Indent"/>
     <w:lsdException w:uiPriority="99" w:semiHidden="0" w:name="List Continue"/>
     <w:lsdException w:uiPriority="99" w:semiHidden="0" w:name="List Continue 2"/>
@@ -14184,7 +14196,7 @@
     <w:lsdException w:uiPriority="99" w:name="Body Text First Indent"/>
     <w:lsdException w:uiPriority="99" w:name="Body Text First Indent 2"/>
     <w:lsdException w:uiPriority="99" w:name="Note Heading"/>
-    <w:lsdException w:uiPriority="99" w:semiHidden="0" w:name="Body Text 2"/>
+    <w:lsdException w:qFormat="1" w:uiPriority="99" w:semiHidden="0" w:name="Body Text 2"/>
     <w:lsdException w:uiPriority="99" w:semiHidden="0" w:name="Body Text 3"/>
     <w:lsdException w:uiPriority="99" w:name="Body Text Indent 2"/>
     <w:lsdException w:uiPriority="99" w:name="Body Text Indent 3"/>
@@ -14207,7 +14219,7 @@
     <w:lsdException w:uiPriority="99" w:name="HTML Sample"/>
     <w:lsdException w:uiPriority="99" w:name="HTML Typewriter"/>
     <w:lsdException w:uiPriority="99" w:name="HTML Variable"/>
-    <w:lsdException w:uiPriority="99" w:name="Normal Table"/>
+    <w:lsdException w:qFormat="1" w:uiPriority="99" w:name="Normal Table"/>
     <w:lsdException w:uiPriority="99" w:name="annotation subject"/>
     <w:lsdException w:uiPriority="99" w:name="Table Simple 1"/>
     <w:lsdException w:uiPriority="99" w:name="Table Simple 2"/>
@@ -14257,7 +14269,7 @@
     <w:lsdException w:qFormat="1" w:unhideWhenUsed="0" w:uiPriority="1" w:semiHidden="0" w:name="No Spacing"/>
     <w:lsdException w:unhideWhenUsed="0" w:uiPriority="60" w:semiHidden="0" w:name="Light Shading"/>
     <w:lsdException w:unhideWhenUsed="0" w:uiPriority="61" w:semiHidden="0" w:name="Light List"/>
-    <w:lsdException w:unhideWhenUsed="0" w:uiPriority="62" w:semiHidden="0" w:name="Light Grid"/>
+    <w:lsdException w:qFormat="1" w:unhideWhenUsed="0" w:uiPriority="62" w:semiHidden="0" w:name="Light Grid"/>
     <w:lsdException w:unhideWhenUsed="0" w:uiPriority="63" w:semiHidden="0" w:name="Medium Shading 1"/>
     <w:lsdException w:unhideWhenUsed="0" w:uiPriority="64" w:semiHidden="0" w:name="Medium Shading 2"/>
     <w:lsdException w:unhideWhenUsed="0" w:uiPriority="65" w:semiHidden="0" w:name="Medium List 1"/>
@@ -14341,11 +14353,11 @@
     <w:lsdException w:unhideWhenUsed="0" w:uiPriority="70" w:semiHidden="0" w:name="Dark List Accent 5"/>
     <w:lsdException w:unhideWhenUsed="0" w:uiPriority="71" w:semiHidden="0" w:name="Colorful Shading Accent 5"/>
     <w:lsdException w:unhideWhenUsed="0" w:uiPriority="72" w:semiHidden="0" w:name="Colorful List Accent 5"/>
-    <w:lsdException w:unhideWhenUsed="0" w:uiPriority="73" w:semiHidden="0" w:name="Colorful Grid Accent 5"/>
+    <w:lsdException w:qFormat="1" w:unhideWhenUsed="0" w:uiPriority="73" w:semiHidden="0" w:name="Colorful Grid Accent 5"/>
     <w:lsdException w:unhideWhenUsed="0" w:uiPriority="60" w:semiHidden="0" w:name="Light Shading Accent 6"/>
     <w:lsdException w:unhideWhenUsed="0" w:uiPriority="61" w:semiHidden="0" w:name="Light List Accent 6"/>
     <w:lsdException w:unhideWhenUsed="0" w:uiPriority="62" w:semiHidden="0" w:name="Light Grid Accent 6"/>
-    <w:lsdException w:unhideWhenUsed="0" w:uiPriority="63" w:semiHidden="0" w:name="Medium Shading 1 Accent 6"/>
+    <w:lsdException w:qFormat="1" w:unhideWhenUsed="0" w:uiPriority="63" w:semiHidden="0" w:name="Medium Shading 1 Accent 6"/>
     <w:lsdException w:unhideWhenUsed="0" w:uiPriority="64" w:semiHidden="0" w:name="Medium Shading 2 Accent 6"/>
     <w:lsdException w:unhideWhenUsed="0" w:uiPriority="65" w:semiHidden="0" w:name="Medium List 1 Accent 6"/>
     <w:lsdException w:unhideWhenUsed="0" w:uiPriority="66" w:semiHidden="0" w:name="Medium List 2 Accent 6"/>
@@ -14602,12 +14614,14 @@
     <w:name w:val="Default Paragraph Font"/>
     <w:semiHidden/>
     <w:unhideWhenUsed/>
+    <w:qFormat/>
     <w:uiPriority w:val="1"/>
   </w:style>
   <w:style w:type="table" w:default="1" w:styleId="12">
     <w:name w:val="Normal Table"/>
     <w:semiHidden/>
     <w:unhideWhenUsed/>
+    <w:qFormat/>
     <w:uiPriority w:val="99"/>
     <w:tblPr>
       <w:tblCellMar>
@@ -14623,6 +14637,7 @@
     <w:basedOn w:val="1"/>
     <w:link w:val="146"/>
     <w:unhideWhenUsed/>
+    <w:qFormat/>
     <w:uiPriority w:val="99"/>
     <w:pPr>
       <w:spacing w:after="120"/>
@@ -14633,6 +14648,7 @@
     <w:basedOn w:val="1"/>
     <w:link w:val="147"/>
     <w:unhideWhenUsed/>
+    <w:qFormat/>
     <w:uiPriority w:val="99"/>
     <w:pPr>
       <w:spacing w:after="120" w:line="480" w:lineRule="auto"/>
@@ -14691,6 +14707,7 @@
     <w:basedOn w:val="1"/>
     <w:link w:val="138"/>
     <w:unhideWhenUsed/>
+    <w:qFormat/>
     <w:uiPriority w:val="99"/>
     <w:pPr>
       <w:tabs>
@@ -14705,6 +14722,7 @@
     <w:basedOn w:val="1"/>
     <w:link w:val="137"/>
     <w:unhideWhenUsed/>
+    <w:qFormat/>
     <w:uiPriority w:val="99"/>
     <w:pPr>
       <w:tabs>
@@ -14825,6 +14843,7 @@
     <w:name w:val="List Number"/>
     <w:basedOn w:val="1"/>
     <w:unhideWhenUsed/>
+    <w:qFormat/>
     <w:uiPriority w:val="99"/>
     <w:pPr>
       <w:numPr>
@@ -14842,6 +14861,7 @@
     <w:name w:val="List Number 2"/>
     <w:basedOn w:val="1"/>
     <w:unhideWhenUsed/>
+    <w:qFormat/>
     <w:uiPriority w:val="99"/>
     <w:pPr>
       <w:numPr>
@@ -14855,6 +14875,7 @@
     <w:name w:val="List Number 3"/>
     <w:basedOn w:val="1"/>
     <w:unhideWhenUsed/>
+    <w:qFormat/>
     <w:uiPriority w:val="99"/>
     <w:pPr>
       <w:numPr>
@@ -16333,6 +16354,7 @@
   <w:style w:type="table" w:styleId="53">
     <w:name w:val="Light Grid"/>
     <w:basedOn w:val="12"/>
+    <w:qFormat/>
     <w:uiPriority w:val="62"/>
     <w:pPr>
       <w:spacing w:after="0" w:line="240" w:lineRule="auto"/>
@@ -17857,6 +17879,7 @@
   <w:style w:type="table" w:styleId="66">
     <w:name w:val="Medium Shading 1 Accent 6"/>
     <w:basedOn w:val="12"/>
+    <w:qFormat/>
     <w:uiPriority w:val="63"/>
     <w:pPr>
       <w:spacing w:after="0" w:line="240" w:lineRule="auto"/>
@@ -26201,6 +26224,7 @@
   <w:style w:type="table" w:styleId="135">
     <w:name w:val="Colorful Grid Accent 5"/>
     <w:basedOn w:val="12"/>
+    <w:qFormat/>
     <w:uiPriority w:val="73"/>
     <w:pPr>
       <w:spacing w:after="0" w:line="240" w:lineRule="auto"/>
@@ -26401,6 +26425,7 @@
     <w:name w:val="Footer Char"/>
     <w:basedOn w:val="11"/>
     <w:link w:val="18"/>
+    <w:qFormat/>
     <w:uiPriority w:val="99"/>
   </w:style>
   <w:style w:type="paragraph" w:styleId="139">
@@ -26421,6 +26446,7 @@
     <w:name w:val="Heading 1 Char"/>
     <w:basedOn w:val="11"/>
     <w:link w:val="2"/>
+    <w:qFormat/>
     <w:uiPriority w:val="9"/>
     <w:rPr>
       <w:rFonts w:asciiTheme="majorHAnsi" w:hAnsiTheme="majorHAnsi" w:eastAsiaTheme="majorEastAsia" w:cstheme="majorBidi"/>
@@ -26435,6 +26461,7 @@
     <w:name w:val="Heading 2 Char"/>
     <w:basedOn w:val="11"/>
     <w:link w:val="3"/>
+    <w:qFormat/>
     <w:uiPriority w:val="9"/>
     <w:rPr>
       <w:rFonts w:asciiTheme="majorHAnsi" w:hAnsiTheme="majorHAnsi" w:eastAsiaTheme="majorEastAsia" w:cstheme="majorBidi"/>
@@ -26454,6 +26481,7 @@
     <w:name w:val="Heading 3 Char"/>
     <w:basedOn w:val="11"/>
     <w:link w:val="4"/>
+    <w:qFormat/>
     <w:uiPriority w:val="9"/>
     <w:rPr>
       <w:rFonts w:asciiTheme="majorHAnsi" w:hAnsiTheme="majorHAnsi" w:eastAsiaTheme="majorEastAsia" w:cstheme="majorBidi"/>
@@ -26471,6 +26499,7 @@
     <w:name w:val="Title Char"/>
     <w:basedOn w:val="11"/>
     <w:link w:val="36"/>
+    <w:qFormat/>
     <w:uiPriority w:val="10"/>
     <w:rPr>
       <w:rFonts w:asciiTheme="majorHAnsi" w:hAnsiTheme="majorHAnsi" w:eastAsiaTheme="majorEastAsia" w:cstheme="majorBidi"/>
@@ -26515,18 +26544,21 @@
     <w:name w:val="Body Text Char"/>
     <w:basedOn w:val="11"/>
     <w:link w:val="13"/>
+    <w:qFormat/>
     <w:uiPriority w:val="99"/>
   </w:style>
   <w:style w:type="character" w:customStyle="1" w:styleId="147">
     <w:name w:val="Body Text 2 Char"/>
     <w:basedOn w:val="11"/>
     <w:link w:val="14"/>
+    <w:qFormat/>
     <w:uiPriority w:val="99"/>
   </w:style>
   <w:style w:type="character" w:customStyle="1" w:styleId="148">
     <w:name w:val="Body Text 3 Char"/>
     <w:basedOn w:val="11"/>
     <w:link w:val="15"/>
+    <w:qFormat/>
     <w:uiPriority w:val="99"/>
     <w:rPr>
       <w:sz w:val="16"/>
@@ -26566,6 +26598,7 @@
     <w:name w:val="Quote Char"/>
     <w:basedOn w:val="11"/>
     <w:link w:val="150"/>
+    <w:qFormat/>
     <w:uiPriority w:val="29"/>
     <w:rPr>
       <w:i/>
@@ -26603,6 +26636,7 @@
     <w:basedOn w:val="11"/>
     <w:link w:val="6"/>
     <w:semiHidden/>
+    <w:qFormat/>
     <w:uiPriority w:val="9"/>
     <w:rPr>
       <w:rFonts w:asciiTheme="majorHAnsi" w:hAnsiTheme="majorHAnsi" w:eastAsiaTheme="majorEastAsia" w:cstheme="majorBidi"/>
@@ -26614,6 +26648,7 @@
     <w:basedOn w:val="11"/>
     <w:link w:val="7"/>
     <w:semiHidden/>
+    <w:qFormat/>
     <w:uiPriority w:val="9"/>
     <w:rPr>
       <w:rFonts w:asciiTheme="majorHAnsi" w:hAnsiTheme="majorHAnsi" w:eastAsiaTheme="majorEastAsia" w:cstheme="majorBidi"/>
@@ -26627,6 +26662,7 @@
     <w:basedOn w:val="11"/>
     <w:link w:val="8"/>
     <w:semiHidden/>
+    <w:qFormat/>
     <w:uiPriority w:val="9"/>
     <w:rPr>
       <w:rFonts w:asciiTheme="majorHAnsi" w:hAnsiTheme="majorHAnsi" w:eastAsiaTheme="majorEastAsia" w:cstheme="majorBidi"/>
@@ -26648,6 +26684,7 @@
     <w:basedOn w:val="11"/>
     <w:link w:val="9"/>
     <w:semiHidden/>
+    <w:qFormat/>
     <w:uiPriority w:val="9"/>
     <w:rPr>
       <w:rFonts w:asciiTheme="majorHAnsi" w:hAnsiTheme="majorHAnsi" w:eastAsiaTheme="majorEastAsia" w:cstheme="majorBidi"/>

</xml_diff>